<commit_message>
Envoi direct, destinataire unique et nouvelles gravités
</commit_message>
<xml_diff>
--- a/Masque-NOTE-TECHNIQUE-AUTOMATIQUE.docx
+++ b/Masque-NOTE-TECHNIQUE-AUTOMATIQUE.docx
@@ -954,7 +954,7 @@
         <w:tc>
           <w:tcPr>
             <w:tcW w:w="2289" w:type="dxa"/>
-            <w:shd w:val="clear" w:color="auto" w:fill="70AD47" w:themeFill="accent6"/>
+            <w:shd w:val="clear" w:color="auto" w:fill="4F8A3D" w:themeFill="accent6"/>
             <w:vAlign w:val="center"/>
           </w:tcPr>
           <w:p>
@@ -1011,7 +1011,7 @@
         <w:tc>
           <w:tcPr>
             <w:tcW w:w="2289" w:type="dxa"/>
-            <w:shd w:val="clear" w:color="auto" w:fill="FFFF00"/>
+            <w:shd w:val="clear" w:color="auto" w:fill="D6A000"/>
             <w:vAlign w:val="center"/>
           </w:tcPr>
           <w:p>
@@ -1068,7 +1068,7 @@
         <w:tc>
           <w:tcPr>
             <w:tcW w:w="2289" w:type="dxa"/>
-            <w:shd w:val="clear" w:color="auto" w:fill="ED7D31" w:themeFill="accent2"/>
+            <w:shd w:val="clear" w:color="auto" w:fill="E26B0A" w:themeFill="accent2"/>
             <w:vAlign w:val="center"/>
           </w:tcPr>
           <w:p>
@@ -1119,7 +1119,7 @@
         <w:tc>
           <w:tcPr>
             <w:tcW w:w="2289" w:type="dxa"/>
-            <w:shd w:val="clear" w:color="auto" w:fill="FF0000"/>
+            <w:shd w:val="clear" w:color="auto" w:fill="B91C1C"/>
             <w:vAlign w:val="center"/>
           </w:tcPr>
           <w:p>
@@ -1143,7 +1143,7 @@
               <w:jc w:val="center"/>
             </w:pPr>
             <w:r>
-              <w:t>Risque imminent</w:t>
+              <w:t>Risque critique</w:t>
             </w:r>
           </w:p>
         </w:tc>

</xml_diff>